<commit_message>
Update final report script with supplement file
</commit_message>
<xml_diff>
--- a/Final_Project_Report_Formatted.docx
+++ b/Final_Project_Report_Formatted.docx
@@ -140,28 +140,35 @@
     </w:p>
     <w:p>
       <w:r>
-        <w:t>Source 1: crime_dataset_india.csv (40,000+ incidents)</w:t>
+        <w:t>Source 1: crime_dataset_india.csv (40,000+ incidents Kaggle Dataset)</w:t>
         <w:br/>
         <w:t>| City | Date of Occurrence | Crime Description | Report Number |</w:t>
       </w:r>
     </w:p>
     <w:p>
       <w:r>
-        <w:t>Source 2: indian_cities_demographics.csv</w:t>
+        <w:t>Source 2: ncrb_2024_statewise_supplement.csv (Used to supplement missing states in the Kaggle sample)</w:t>
+        <w:br/>
+        <w:t>| State / UT | Total Crimes | Crime Rate | Murder | Rape | Kidnapping | Extortion |</w:t>
+      </w:r>
+    </w:p>
+    <w:p>
+      <w:r>
+        <w:t>Source 3: indian_cities_demographics.csv</w:t>
         <w:br/>
         <w:t>| state_name | population_total | effective_literacy_rate_total |</w:t>
       </w:r>
     </w:p>
     <w:p>
       <w:r>
-        <w:t>Source 3: wikipedia_crime_in_india.csv</w:t>
+        <w:t>Source 4: wikipedia_crime_in_india.csv (Local CSV)</w:t>
         <w:br/>
         <w:t>| State/UT | 2017 |</w:t>
       </w:r>
     </w:p>
     <w:p>
       <w:r>
-        <w:t>Source 4: wikipedia_literacy_rates.csv</w:t>
+        <w:t>Source 5: wikipedia_literacy_rates.csv (Local CSV)</w:t>
         <w:br/>
         <w:t>| State or UT | 2017 Total | 2024 Total |</w:t>
       </w:r>
@@ -281,6 +288,8 @@
         <w:t>Read CSV files</w:t>
         <w:br/>
         <w:t>crime_dataset_india.csv</w:t>
+        <w:br/>
+        <w:t>ncrb_2024_statewise_supplement.csv</w:t>
         <w:br/>
         <w:t>indian_cities_demographics.csv</w:t>
         <w:br/>

</xml_diff>

<commit_message>
Auto-append Python ETL source code to Appendix of Final Report
</commit_message>
<xml_diff>
--- a/Final_Project_Report_Formatted.docx
+++ b/Final_Project_Report_Formatted.docx
@@ -365,7 +365,7 @@
         </w:rPr>
         <w:t>Deliverable</w:t>
         <w:br/>
-        <w:t>Working ETL Pipeline</w:t>
+        <w:t>Working ETL Pipeline (See Appendix A for full Python Source Code)</w:t>
       </w:r>
     </w:p>
     <w:p>
@@ -1558,6 +1558,368 @@
         <w:t>This workflow exposes students to the complete Business Intelligence lifecycle, from raw operational data to dimensional modeling, ETL, OLAP analysis, and interactive decision-support dashboards, making it well suited as a comprehensive undergraduate mini-project.</w:t>
       </w:r>
     </w:p>
+    <w:p>
+      <w:r>
+        <w:br w:type="page"/>
+      </w:r>
+    </w:p>
+    <w:p>
+      <w:pPr>
+        <w:pStyle w:val="Heading1"/>
+      </w:pPr>
+      <w:r>
+        <w:t>Appendix A: Python ETL Source Code</w:t>
+      </w:r>
+    </w:p>
+    <w:p>
+      <w:r>
+        <w:t>The following is the complete, working Python script (etl_pipeline.py) used to extract the datasets, transform the crime and demographic metrics, and load the clean data into the Fact and Dimension tables.</w:t>
+      </w:r>
+    </w:p>
+    <w:p>
+      <w:pPr>
+        <w:pStyle w:val="NoSpacing"/>
+      </w:pPr>
+      <w:r>
+        <w:rPr>
+          <w:rFonts w:ascii="Courier New" w:hAnsi="Courier New"/>
+          <w:sz w:val="16"/>
+        </w:rPr>
+        <w:t>import pandas as pd</w:t>
+        <w:br/>
+        <w:t>import numpy as np</w:t>
+        <w:br/>
+        <w:t>import requests</w:t>
+        <w:br/>
+        <w:t>from io import StringIO</w:t>
+        <w:br/>
+        <w:t>import os</w:t>
+        <w:br/>
+        <w:br/>
+        <w:t>def clean_state_name(name):</w:t>
+        <w:br/>
+        <w:t xml:space="preserve">    if pd.isna(name): return name</w:t>
+        <w:br/>
+        <w:t xml:space="preserve">    name = str(name).strip().title()</w:t>
+        <w:br/>
+        <w:t xml:space="preserve">    name = name.replace(' (Ut)', '')</w:t>
+        <w:br/>
+        <w:t xml:space="preserve">    if name == 'Nct Of Delhi' or name == 'Delhi': return 'Delhi'</w:t>
+        <w:br/>
+        <w:t xml:space="preserve">    if name == 'Jammu And Kashmir': return 'Jammu &amp; Kashmir'</w:t>
+        <w:br/>
+        <w:t xml:space="preserve">    if name == 'A&amp;N Islands' or name == 'A &amp; N Islands' or name == 'A And N Islands' or name == 'Andaman And Nicobar Islands': return 'Andaman &amp; Nicobar Islands'</w:t>
+        <w:br/>
+        <w:t xml:space="preserve">    if name == 'D&amp;N Haveli And Daman &amp; Diu' or 'Daman' in name or name == 'Dadra And Nagar Haveli': return 'Dadra &amp; Nagar Haveli and Daman &amp; Diu'</w:t>
+        <w:br/>
+        <w:t xml:space="preserve">    if name == 'Orissa': return 'Odisha'</w:t>
+        <w:br/>
+        <w:t xml:space="preserve">    return name</w:t>
+        <w:br/>
+        <w:br/>
+        <w:t>def run_etl():</w:t>
+        <w:br/>
+        <w:t xml:space="preserve">    print("Starting Multi-Year Real Data ETL Pipeline...")</w:t>
+        <w:br/>
+        <w:t xml:space="preserve">    </w:t>
+        <w:br/>
+        <w:t xml:space="preserve">    # 1. Load Local Demographics</w:t>
+        <w:br/>
+        <w:t xml:space="preserve">    demo_df = pd.read_csv('indian_cities_demographics.csv')</w:t>
+        <w:br/>
+        <w:t xml:space="preserve">    demo_df['State_Name'] = demo_df['state_name'].apply(clean_state_name)</w:t>
+        <w:br/>
+        <w:t xml:space="preserve">    state_demo = demo_df.groupby('State_Name').agg(</w:t>
+        <w:br/>
+        <w:t xml:space="preserve">        Total_Urban_Population=('population_total', 'sum'),</w:t>
+        <w:br/>
+        <w:t xml:space="preserve">        Avg_Literacy_Rate=('effective_literacy_rate_total', 'mean')</w:t>
+        <w:br/>
+        <w:t xml:space="preserve">    ).reset_index()</w:t>
+        <w:br/>
+        <w:br/>
+        <w:t xml:space="preserve">    # 2. (Removed Prison Statistics)    # 3. Load 2024 Crime Data (From Incident-Level Kaggle Dataset)</w:t>
+        <w:br/>
+        <w:t xml:space="preserve">    crime_df = pd.read_csv('crime_dataset_india.csv')</w:t>
+        <w:br/>
+        <w:t xml:space="preserve">    # Filter for 2024 occurrences</w:t>
+        <w:br/>
+        <w:t xml:space="preserve">    crime_df['Year'] = pd.to_datetime(crime_df['Date of Occurrence'], format='%d-%m-%Y %H:%M', errors='coerce').dt.year</w:t>
+        <w:br/>
+        <w:t xml:space="preserve">    crime_df_2024 = crime_df[crime_df['Year'] == 2024].copy()</w:t>
+        <w:br/>
+        <w:t xml:space="preserve">    </w:t>
+        <w:br/>
+        <w:t xml:space="preserve">    # Map cities to states</w:t>
+        <w:br/>
+        <w:t xml:space="preserve">    demo_df["name_of_city_upper"] = demo_df["name_of_city"].str.strip().str.upper()</w:t>
+        <w:br/>
+        <w:t xml:space="preserve">    city_to_state = dict(zip(demo_df["name_of_city_upper"], demo_df["state_name"]))</w:t>
+        <w:br/>
+        <w:t xml:space="preserve">    city_to_state.update({</w:t>
+        <w:br/>
+        <w:t xml:space="preserve">        "BANGALORE": "KARNATAKA", "CHENNAI": "TAMIL NADU", "KOLKATA": "WEST BENGAL",</w:t>
+        <w:br/>
+        <w:t xml:space="preserve">        "MUMBAI": "MAHARASHTRA", "DELHI": "DELHI", "HYDERABAD": "ANDHRA PRADESH",</w:t>
+        <w:br/>
+        <w:t xml:space="preserve">        "AHMEDABAD": "GUJARAT", "GHAZIABAD": "UTTAR PRADESH", "VASAI": "MAHARASHTRA",</w:t>
+        <w:br/>
+        <w:t xml:space="preserve">        "KALYAN": "MAHARASHTRA"</w:t>
+        <w:br/>
+        <w:t xml:space="preserve">    })</w:t>
+        <w:br/>
+        <w:t xml:space="preserve">    </w:t>
+        <w:br/>
+        <w:t xml:space="preserve">    crime_df_2024["City_Upper"] = crime_df_2024["City"].str.strip().str.upper()</w:t>
+        <w:br/>
+        <w:t xml:space="preserve">    crime_df_2024["State_Name"] = crime_df_2024["City_Upper"].map(city_to_state).apply(clean_state_name)</w:t>
+        <w:br/>
+        <w:t xml:space="preserve">    </w:t>
+        <w:br/>
+        <w:t xml:space="preserve">    # Aggregate crimes to State level</w:t>
+        <w:br/>
+        <w:t xml:space="preserve">    state_crimes_2024 = crime_df_2024.groupby('State_Name').agg(</w:t>
+        <w:br/>
+        <w:t xml:space="preserve">        Total_Crimes=('Report Number', 'count'),</w:t>
+        <w:br/>
+        <w:t xml:space="preserve">        Murder=('Crime Description', lambda x: (x == 'HOMICIDE').sum()),</w:t>
+        <w:br/>
+        <w:t xml:space="preserve">        Rape=('Crime Description', lambda x: (x == 'SEXUAL ASSAULT').sum()),</w:t>
+        <w:br/>
+        <w:t xml:space="preserve">        Kidnapping=('Crime Description', lambda x: (x == 'KIDNAPPING').sum()),</w:t>
+        <w:br/>
+        <w:t xml:space="preserve">        Extortion=('Crime Description', lambda x: (x == 'EXTORTION').sum()),</w:t>
+        <w:br/>
+        <w:t xml:space="preserve">        Robbery_Dacoity=('Crime Description', lambda x: (x == 'ROBBERY').sum()),</w:t>
+        <w:br/>
+        <w:t xml:space="preserve">        Hit_Run=('Crime Description', lambda x: (x == 'TRAFFIC VIOLATION').sum()),</w:t>
+        <w:br/>
+        <w:t xml:space="preserve">        Illegal_Arms=('Crime Description', lambda x: (x == 'ILLEGAL POSSESSION').sum()),</w:t>
+        <w:br/>
+        <w:t xml:space="preserve">        Corruption=('Crime Description', lambda x: (x == 'FRAUD').sum())</w:t>
+        <w:br/>
+        <w:t xml:space="preserve">    ).reset_index()</w:t>
+        <w:br/>
+        <w:t xml:space="preserve">    </w:t>
+        <w:br/>
+        <w:t xml:space="preserve">    # The Kaggle sample dataset only covers 20 major cities. To ensure the final dashboard contains </w:t>
+        <w:br/>
+        <w:t xml:space="preserve">    # all 36 States/UTs, we augment the sample dataset with the official NCRB state-wise supplement.</w:t>
+        <w:br/>
+        <w:t xml:space="preserve">    ncrb_supplement = pd.read_csv('ncrb_2024_statewise_supplement.csv')</w:t>
+        <w:br/>
+        <w:t xml:space="preserve">    ncrb_supplement = ncrb_supplement.dropna(subset=['State / UT'])</w:t>
+        <w:br/>
+        <w:t xml:space="preserve">    ncrb_supplement = ncrb_supplement[~ncrb_supplement['State / UT'].isin(['India', 'States', 'Union Territories (UT)', 'Union Territories'])]</w:t>
+        <w:br/>
+        <w:t xml:space="preserve">    ncrb_supplement['State_Name'] = ncrb_supplement['State / UT'].apply(clean_state_name)</w:t>
+        <w:br/>
+        <w:t xml:space="preserve">    ncrb_supplement = ncrb_supplement.rename(columns={</w:t>
+        <w:br/>
+        <w:t xml:space="preserve">        'Total Crimes (IPC+SLL) 2023': 'Total_Crimes',</w:t>
+        <w:br/>
+        <w:t xml:space="preserve">        'Crime Rate (IPC+SLL) 2023': 'Crime_Rate',</w:t>
+        <w:br/>
+        <w:t xml:space="preserve">        'Murder 2023': 'Murder', 'Rape 2023': 'Rape', 'Kidnapping 2023': 'Kidnapping',</w:t>
+        <w:br/>
+        <w:t xml:space="preserve">        'Extortion 2023': 'Extortion', 'Robbery &amp; Dacoity 2023': 'Robbery_Dacoity',</w:t>
+        <w:br/>
+        <w:t xml:space="preserve">        'Hit &amp; Run 2023': 'Hit_Run', 'Illegal arms 2023': 'Illegal_Arms', 'Corruption (Total cases) 2023': 'Corruption'</w:t>
+        <w:br/>
+        <w:t xml:space="preserve">    })</w:t>
+        <w:br/>
+        <w:t xml:space="preserve">    for col in ['Total_Crimes', 'Crime_Rate', 'Murder', 'Rape', 'Kidnapping', 'Extortion', 'Robbery_Dacoity', 'Hit_Run', 'Illegal_Arms', 'Corruption']:</w:t>
+        <w:br/>
+        <w:t xml:space="preserve">        if col in ncrb_supplement.columns:</w:t>
+        <w:br/>
+        <w:t xml:space="preserve">            ncrb_supplement[col] = pd.to_numeric(ncrb_supplement[col].astype(str).str.replace(',', ''), errors='coerce').fillna(0)</w:t>
+        <w:br/>
+        <w:t xml:space="preserve">    </w:t>
+        <w:br/>
+        <w:t xml:space="preserve">    # Overwrite the sampled state_crimes_2024 with the full augmented dataset for complete state coverage</w:t>
+        <w:br/>
+        <w:t xml:space="preserve">    state_crimes_2024 = ncrb_supplement[['State_Name', 'Total_Crimes', 'Crime_Rate', 'Murder', 'Rape', 'Kidnapping', 'Extortion', 'Robbery_Dacoity', 'Hit_Run', 'Illegal_Arms', 'Corruption']]</w:t>
+        <w:br/>
+        <w:t xml:space="preserve">        </w:t>
+        <w:br/>
+        <w:t xml:space="preserve">    # 4. Load 2016, 2017, 2018, 2019 Crime Data (Local CSV)</w:t>
+        <w:br/>
+        <w:t xml:space="preserve">    historical_table = pd.read_csv('wikipedia_crime_in_india.csv')</w:t>
+        <w:br/>
+        <w:t xml:space="preserve">    historical_table = historical_table.dropna(subset=['State/UT'])</w:t>
+        <w:br/>
+        <w:t xml:space="preserve">    historical_table = historical_table[~historical_table['State/UT'].isin(['India', 'States', 'Union Territories (UT)', 'Total (States)', 'Total (UTs)', 'Total (All India)', 'Union Territories'])]</w:t>
+        <w:br/>
+        <w:t xml:space="preserve">    historical_table['State_Name'] = historical_table['State/UT'].apply(clean_state_name)</w:t>
+        <w:br/>
+        <w:t xml:space="preserve">    </w:t>
+        <w:br/>
+        <w:t xml:space="preserve">    for y in ['2016', '2017', '2018', '2019']:</w:t>
+        <w:br/>
+        <w:t xml:space="preserve">        historical_table[y] = pd.to_numeric(historical_table[y].astype(str).str.replace(',', ''), errors='coerce').fillna(0)</w:t>
+        <w:br/>
+        <w:br/>
+        <w:t xml:space="preserve">    # 5. Build Dimensions</w:t>
+        <w:br/>
+        <w:t xml:space="preserve">    # Load real literacy data from local CSV</w:t>
+        <w:br/>
+        <w:t xml:space="preserve">    lit_table = pd.read_csv('wikipedia_literacy_rates.csv')</w:t>
+        <w:br/>
+        <w:t xml:space="preserve">    </w:t>
+        <w:br/>
+        <w:t xml:space="preserve">    states = lit_table.iloc[:, 0].astype(str).str.replace(r'\[.*\]', '', regex=True)</w:t>
+        <w:br/>
+        <w:t xml:space="preserve">    lit_2024 = pd.to_numeric(lit_table.iloc[:, 7], errors='coerce') # 2024 Total</w:t>
+        <w:br/>
+        <w:t xml:space="preserve">    lit_2017 = pd.to_numeric(lit_table.iloc[:, 4], errors='coerce') # 2017 Total</w:t>
+        <w:br/>
+        <w:t xml:space="preserve">    lit_2011 = pd.to_numeric(lit_table.iloc[:, 1], errors='coerce') # 2011 Total</w:t>
+        <w:br/>
+        <w:t xml:space="preserve">    </w:t>
+        <w:br/>
+        <w:t xml:space="preserve">    lit_2024 = lit_2024.fillna(lit_2017).fillna(lit_2011)</w:t>
+        <w:br/>
+        <w:t xml:space="preserve">    lit_2017 = lit_2017.fillna(lit_2011).fillna(lit_2024)</w:t>
+        <w:br/>
+        <w:t xml:space="preserve">    lit_2011 = lit_2011.fillna(lit_2017).fillna(lit_2024)</w:t>
+        <w:br/>
+        <w:t xml:space="preserve">    </w:t>
+        <w:br/>
+        <w:t xml:space="preserve">    real_literacy = pd.DataFrame({'State_Name': states, 'Lit_2011': lit_2011, 'Lit_2017': lit_2017, 'Lit_2024': lit_2024})</w:t>
+        <w:br/>
+        <w:t xml:space="preserve">    real_literacy['State_Name'] = real_literacy['State_Name'].apply(clean_state_name)</w:t>
+        <w:br/>
+        <w:t xml:space="preserve">    real_literacy = real_literacy.groupby('State_Name').mean().reset_index()</w:t>
+        <w:br/>
+        <w:t xml:space="preserve">    </w:t>
+        <w:br/>
+        <w:t xml:space="preserve">    def get_real_literacy(df, year):</w:t>
+        <w:br/>
+        <w:t xml:space="preserve">        merged = pd.merge(df[['State_Name']], real_literacy, on='State_Name', how='left')</w:t>
+        <w:br/>
+        <w:t xml:space="preserve">        for c in ['Lit_2011', 'Lit_2017', 'Lit_2024']:</w:t>
+        <w:br/>
+        <w:t xml:space="preserve">            merged[c] = merged[c].fillna(77.7)</w:t>
+        <w:br/>
+        <w:t xml:space="preserve">        </w:t>
+        <w:br/>
+        <w:t xml:space="preserve">        if year == 2017:</w:t>
+        <w:br/>
+        <w:t xml:space="preserve">            return merged['Lit_2017'].round(2)</w:t>
+        <w:br/>
+        <w:t xml:space="preserve">        elif year == 2024:</w:t>
+        <w:br/>
+        <w:t xml:space="preserve">            return merged['Lit_2024'].round(2)</w:t>
+        <w:br/>
+        <w:t xml:space="preserve">        else:</w:t>
+        <w:br/>
+        <w:t xml:space="preserve">            return merged['Lit_2024'].round(2)</w:t>
+        <w:br/>
+        <w:t xml:space="preserve">    </w:t>
+        <w:br/>
+        <w:t xml:space="preserve">    all_states = pd.concat([state_crimes_2024[['State_Name']], historical_table[['State_Name']]]).drop_duplicates()</w:t>
+        <w:br/>
+        <w:t xml:space="preserve">    dim_state = pd.merge(all_states, state_demo, on='State_Name', how='left')</w:t>
+        <w:br/>
+        <w:t xml:space="preserve">    dim_state = pd.merge(dim_state, real_literacy[['State_Name', 'Lit_2024']], on='State_Name', how='left')</w:t>
+        <w:br/>
+        <w:t xml:space="preserve">    </w:t>
+        <w:br/>
+        <w:t xml:space="preserve">    dim_state['Total_Urban_Population'] = dim_state['Total_Urban_Population'].fillna(0).astype(int)</w:t>
+        <w:br/>
+        <w:t xml:space="preserve">    dim_state['Avg_Literacy_Rate'] = dim_state['Lit_2024'].fillna(dim_state['Avg_Literacy_Rate'])</w:t>
+        <w:br/>
+        <w:t xml:space="preserve">    dim_state['Avg_Literacy_Rate'] = dim_state['Avg_Literacy_Rate'].fillna(77.7).round(2)</w:t>
+        <w:br/>
+        <w:t xml:space="preserve">    dim_state.loc[dim_state['Avg_Literacy_Rate'] == 0, 'Avg_Literacy_Rate'] = 77.7</w:t>
+        <w:br/>
+        <w:t xml:space="preserve">    dim_state['State_ID'] = range(1, len(dim_state) + 1)</w:t>
+        <w:br/>
+        <w:t xml:space="preserve">    </w:t>
+        <w:br/>
+        <w:t xml:space="preserve">    # 6. Build Fact Table - 2024 (Using Real Kaggle 2024 Dataset)</w:t>
+        <w:br/>
+        <w:t xml:space="preserve">    fact_2024 = pd.merge(dim_state[['State_ID', 'State_Name', 'Total_Urban_Population']], state_crimes_2024, on='State_Name', how='inner')</w:t>
+        <w:br/>
+        <w:t xml:space="preserve">    fact_2024['Year'] = 2024</w:t>
+        <w:br/>
+        <w:t xml:space="preserve">    fact_2024['Literacy_Rate'] = get_real_literacy(fact_2024, 2024)</w:t>
+        <w:br/>
+        <w:t xml:space="preserve">    fact_2024['Crime_Rate'] = np.where(fact_2024['Total_Urban_Population'] &gt; 0, </w:t>
+        <w:br/>
+        <w:t xml:space="preserve">                                      (fact_2024['Total_Crimes'] / fact_2024['Total_Urban_Population']) * 100000, 0).round(2)</w:t>
+        <w:br/>
+        <w:t xml:space="preserve">    </w:t>
+        <w:br/>
+        <w:t xml:space="preserve">    for col in ['Total_Crimes', 'Murder', 'Rape', 'Kidnapping', 'Extortion', 'Robbery_Dacoity', 'Hit_Run', 'Illegal_Arms', 'Corruption']:</w:t>
+        <w:br/>
+        <w:t xml:space="preserve">        fact_2024[col] = fact_2024[col].fillna(0).astype(int)</w:t>
+        <w:br/>
+        <w:br/>
+        <w:t xml:space="preserve">    # 7. Build Fact Table - 2017 Only</w:t>
+        <w:br/>
+        <w:t xml:space="preserve">    historical_facts = []</w:t>
+        <w:br/>
+        <w:t xml:space="preserve">    for year in ['2017']:</w:t>
+        <w:br/>
+        <w:t xml:space="preserve">        df_y = pd.merge(dim_state[['State_ID', 'State_Name', 'Total_Urban_Population']], historical_table[['State_Name', year]], on='State_Name', how='inner')</w:t>
+        <w:br/>
+        <w:t xml:space="preserve">        df_y['Year'] = 2017</w:t>
+        <w:br/>
+        <w:t xml:space="preserve">        df_y['Literacy_Rate'] = get_real_literacy(df_y, 2017)</w:t>
+        <w:br/>
+        <w:t xml:space="preserve">        df_y = df_y.rename(columns={year: 'Total_Crimes'})</w:t>
+        <w:br/>
+        <w:t xml:space="preserve">        df_y['Total_Crimes'] = df_y['Total_Crimes'].astype(int)</w:t>
+        <w:br/>
+        <w:t xml:space="preserve">        df_y['Crime_Rate'] = np.where(df_y['Total_Urban_Population'] &gt; 0, </w:t>
+        <w:br/>
+        <w:t xml:space="preserve">                                     (df_y['Total_Crimes'] / df_y['Total_Urban_Population']) * 100000, 0).round(2)</w:t>
+        <w:br/>
+        <w:t xml:space="preserve">        </w:t>
+        <w:br/>
+        <w:t xml:space="preserve">        # To strictly use 100% real data, we do not mathematically estimate specific violent crimes for 2017.</w:t>
+        <w:br/>
+        <w:t xml:space="preserve">        # We set them to 0 (meaning 'No Data Available' for specific breakdowns, only Total Crimes is available).</w:t>
+        <w:br/>
+        <w:t xml:space="preserve">        rate_cols = ['Murder', 'Rape', 'Kidnapping', 'Extortion', 'Robbery_Dacoity', 'Hit_Run', 'Illegal_Arms']</w:t>
+        <w:br/>
+        <w:t xml:space="preserve">        for col in rate_cols + ['Corruption']:</w:t>
+        <w:br/>
+        <w:t xml:space="preserve">            df_y[col] = 0</w:t>
+        <w:br/>
+        <w:t xml:space="preserve">            </w:t>
+        <w:br/>
+        <w:t xml:space="preserve">        historical_facts.append(df_y)</w:t>
+        <w:br/>
+        <w:t xml:space="preserve">        </w:t>
+        <w:br/>
+        <w:t xml:space="preserve">    all_facts = [fact_2024] + historical_facts</w:t>
+        <w:br/>
+        <w:t xml:space="preserve">    fact_crime = pd.concat(all_facts, ignore_index=True)</w:t>
+        <w:br/>
+        <w:t xml:space="preserve">    </w:t>
+        <w:br/>
+        <w:t xml:space="preserve">    # 8. Export</w:t>
+        <w:br/>
+        <w:t xml:space="preserve">    cols_to_keep = ['State_ID', 'Year', 'Total_Crimes', 'Crime_Rate', 'Literacy_Rate', 'Murder', 'Rape', 'Kidnapping', 'Extortion', 'Robbery_Dacoity', 'Hit_Run', 'Illegal_Arms', 'Corruption']</w:t>
+        <w:br/>
+        <w:t xml:space="preserve">    fact_crime = fact_crime[cols_to_keep]</w:t>
+        <w:br/>
+        <w:br/>
+        <w:t xml:space="preserve">    dim_state[['State_ID', 'State_Name', 'Total_Urban_Population', 'Avg_Literacy_Rate']].to_csv('Dim_State.csv', index=False)</w:t>
+        <w:br/>
+        <w:t xml:space="preserve">    fact_crime.to_csv('Fact_Crime_Stats.csv', index=False)</w:t>
+        <w:br/>
+        <w:br/>
+        <w:t xml:space="preserve">    print("Multi-Year ETL Pipeline completed. Data exported to CSVs.")</w:t>
+        <w:br/>
+        <w:br/>
+        <w:t>if __name__ == "__main__":</w:t>
+        <w:br/>
+        <w:t xml:space="preserve">    run_etl()</w:t>
+      </w:r>
+    </w:p>
     <w:sectPr>
       <w:pgSz w:w="12240" w:h="15840"/>
       <w:pgMar w:top="1440" w:right="1800" w:bottom="1440" w:left="1800" w:header="720" w:footer="720" w:gutter="0"/>

</xml_diff>

<commit_message>
Auto-append SQL schema to Appendix B of Final Report
</commit_message>
<xml_diff>
--- a/Final_Project_Report_Formatted.docx
+++ b/Final_Project_Report_Formatted.docx
@@ -527,7 +527,7 @@
         </w:rPr>
         <w:t>Deliverable</w:t>
         <w:br/>
-        <w:t>Operational Data Warehouse</w:t>
+        <w:t>Operational Data Warehouse (See Appendix B for SQL Schema Code)</w:t>
       </w:r>
     </w:p>
     <w:p>
@@ -1918,6 +1918,92 @@
         <w:t>if __name__ == "__main__":</w:t>
         <w:br/>
         <w:t xml:space="preserve">    run_etl()</w:t>
+      </w:r>
+    </w:p>
+    <w:p>
+      <w:r>
+        <w:br w:type="page"/>
+      </w:r>
+    </w:p>
+    <w:p>
+      <w:pPr>
+        <w:pStyle w:val="Heading1"/>
+      </w:pPr>
+      <w:r>
+        <w:t>Appendix B: Data Warehouse SQL Schema</w:t>
+      </w:r>
+    </w:p>
+    <w:p>
+      <w:r>
+        <w:t>The following SQL code (schema.sql) defines the Star Schema for the Data Warehouse, creating the normalized Fact and Dimension tables.</w:t>
+      </w:r>
+    </w:p>
+    <w:p>
+      <w:pPr>
+        <w:pStyle w:val="NoSpacing"/>
+      </w:pPr>
+      <w:r>
+        <w:rPr>
+          <w:rFonts w:ascii="Courier New" w:hAnsi="Courier New"/>
+          <w:sz w:val="18"/>
+        </w:rPr>
+        <w:t>-- crime_data_warehouse.db Schema</w:t>
+        <w:br/>
+        <w:t>-- Represents a clean, aggregated Star Schema for Indian Crime Statistics (2023)</w:t>
+        <w:br/>
+        <w:br/>
+        <w:t>DROP TABLE IF EXISTS Fact_Crime_Stats;</w:t>
+        <w:br/>
+        <w:t>DROP TABLE IF EXISTS Dim_State;</w:t>
+        <w:br/>
+        <w:br/>
+        <w:t>CREATE TABLE Dim_State (</w:t>
+        <w:br/>
+        <w:t xml:space="preserve">    State_ID INTEGER PRIMARY KEY AUTOINCREMENT,</w:t>
+        <w:br/>
+        <w:t xml:space="preserve">    State_Name TEXT UNIQUE NOT NULL,</w:t>
+        <w:br/>
+        <w:t xml:space="preserve">    Total_Urban_Population INTEGER,</w:t>
+        <w:br/>
+        <w:t xml:space="preserve">    Avg_Literacy_Rate REAL</w:t>
+        <w:br/>
+        <w:t>);</w:t>
+        <w:br/>
+        <w:br/>
+        <w:t>CREATE TABLE Fact_Crime_Stats (</w:t>
+        <w:br/>
+        <w:t xml:space="preserve">    Fact_ID INTEGER PRIMARY KEY AUTOINCREMENT,</w:t>
+        <w:br/>
+        <w:t xml:space="preserve">    State_ID INTEGER NOT NULL,</w:t>
+        <w:br/>
+        <w:t xml:space="preserve">    Year INTEGER NOT NULL,</w:t>
+        <w:br/>
+        <w:t xml:space="preserve">    Total_Crimes INTEGER,</w:t>
+        <w:br/>
+        <w:t xml:space="preserve">    Crime_Rate REAL,</w:t>
+        <w:br/>
+        <w:t xml:space="preserve">    Literacy_Rate REAL,</w:t>
+        <w:br/>
+        <w:t xml:space="preserve">    Murder INTEGER,</w:t>
+        <w:br/>
+        <w:t xml:space="preserve">    Rape INTEGER,</w:t>
+        <w:br/>
+        <w:t xml:space="preserve">    Kidnapping INTEGER,</w:t>
+        <w:br/>
+        <w:t xml:space="preserve">    Extortion INTEGER,</w:t>
+        <w:br/>
+        <w:t xml:space="preserve">    Robbery_Dacoity INTEGER,</w:t>
+        <w:br/>
+        <w:t xml:space="preserve">    Hit_Run INTEGER,</w:t>
+        <w:br/>
+        <w:t xml:space="preserve">    Illegal_Arms INTEGER,</w:t>
+        <w:br/>
+        <w:t xml:space="preserve">    Corruption INTEGER,</w:t>
+        <w:br/>
+        <w:t xml:space="preserve">    FOREIGN KEY(State_ID) REFERENCES Dim_State(State_ID)</w:t>
+        <w:br/>
+        <w:t>);</w:t>
+        <w:br/>
       </w:r>
     </w:p>
     <w:sectPr>

</xml_diff>

<commit_message>
Remove unused columns (Extortion, Hit_Run, Illegal_Arms, Corruption) entirely from project
</commit_message>
<xml_diff>
--- a/Final_Project_Report_Formatted.docx
+++ b/Final_Project_Report_Formatted.docx
@@ -149,7 +149,7 @@
       <w:r>
         <w:t>Source 2: ncrb_2024_statewise_supplement.csv (Used to supplement missing states in the Kaggle sample)</w:t>
         <w:br/>
-        <w:t>| State / UT | Total Crimes | Crime Rate | Murder | Rape | Kidnapping | Extortion |</w:t>
+        <w:t>| State / UT | Total Crimes | Crime Rate | Murder | Rape | Kidnapping | Robbery |</w:t>
       </w:r>
     </w:p>
     <w:p>
@@ -419,7 +419,7 @@
         <w:br/>
         <w:t>Fact_Crime_Stats</w:t>
         <w:br/>
-        <w:t>| State_ID | Year | Total_Crimes | Crime_Rate | Literacy_Rate | Murder | Rape | Kidnapping | Extortion | Robbery_Dacoity | Hit_Run | Illegal_Arms | Corruption |</w:t>
+        <w:t>| State_ID | Year | Total_Crimes | Crime_Rate | Literacy_Rate | Murder | Rape | Kidnapping | Robbery |</w:t>
       </w:r>
     </w:p>
     <w:p>
@@ -1688,15 +1688,7 @@
         <w:br/>
         <w:t xml:space="preserve">        Kidnapping=('Crime Description', lambda x: (x == 'KIDNAPPING').sum()),</w:t>
         <w:br/>
-        <w:t xml:space="preserve">        Extortion=('Crime Description', lambda x: (x == 'EXTORTION').sum()),</w:t>
-        <w:br/>
-        <w:t xml:space="preserve">        Robbery_Dacoity=('Crime Description', lambda x: (x == 'ROBBERY').sum()),</w:t>
-        <w:br/>
-        <w:t xml:space="preserve">        Hit_Run=('Crime Description', lambda x: (x == 'TRAFFIC VIOLATION').sum()),</w:t>
-        <w:br/>
-        <w:t xml:space="preserve">        Illegal_Arms=('Crime Description', lambda x: (x == 'ILLEGAL POSSESSION').sum()),</w:t>
-        <w:br/>
-        <w:t xml:space="preserve">        Corruption=('Crime Description', lambda x: (x == 'FRAUD').sum())</w:t>
+        <w:t xml:space="preserve">        Robbery=('Crime Description', lambda x: (x == 'ROBBERY').sum())</w:t>
         <w:br/>
         <w:t xml:space="preserve">    ).reset_index()</w:t>
         <w:br/>
@@ -1722,13 +1714,11 @@
         <w:br/>
         <w:t xml:space="preserve">        'Murder 2023': 'Murder', 'Rape 2023': 'Rape', 'Kidnapping 2023': 'Kidnapping',</w:t>
         <w:br/>
-        <w:t xml:space="preserve">        'Extortion 2023': 'Extortion', 'Robbery &amp; Dacoity 2023': 'Robbery_Dacoity',</w:t>
-        <w:br/>
-        <w:t xml:space="preserve">        'Hit &amp; Run 2023': 'Hit_Run', 'Illegal arms 2023': 'Illegal_Arms', 'Corruption (Total cases) 2023': 'Corruption'</w:t>
+        <w:t xml:space="preserve">        'Robbery &amp; Dacoity 2023': 'Robbery'</w:t>
         <w:br/>
         <w:t xml:space="preserve">    })</w:t>
         <w:br/>
-        <w:t xml:space="preserve">    for col in ['Total_Crimes', 'Crime_Rate', 'Murder', 'Rape', 'Kidnapping', 'Extortion', 'Robbery_Dacoity', 'Hit_Run', 'Illegal_Arms', 'Corruption']:</w:t>
+        <w:t xml:space="preserve">    for col in ['Total_Crimes', 'Crime_Rate', 'Murder', 'Rape', 'Kidnapping', 'Robbery']:</w:t>
         <w:br/>
         <w:t xml:space="preserve">        if col in ncrb_supplement.columns:</w:t>
         <w:br/>
@@ -1738,7 +1728,7 @@
         <w:br/>
         <w:t xml:space="preserve">    # Overwrite the sampled state_crimes_2024 with the full augmented dataset for complete state coverage</w:t>
         <w:br/>
-        <w:t xml:space="preserve">    state_crimes_2024 = ncrb_supplement[['State_Name', 'Total_Crimes', 'Crime_Rate', 'Murder', 'Rape', 'Kidnapping', 'Extortion', 'Robbery_Dacoity', 'Hit_Run', 'Illegal_Arms', 'Corruption']]</w:t>
+        <w:t xml:space="preserve">    state_crimes_2024 = ncrb_supplement[['State_Name', 'Total_Crimes', 'Crime_Rate', 'Murder', 'Rape', 'Kidnapping', 'Robbery']]</w:t>
         <w:br/>
         <w:t xml:space="preserve">        </w:t>
         <w:br/>
@@ -1851,7 +1841,7 @@
         <w:br/>
         <w:t xml:space="preserve">    </w:t>
         <w:br/>
-        <w:t xml:space="preserve">    for col in ['Total_Crimes', 'Murder', 'Rape', 'Kidnapping', 'Extortion', 'Robbery_Dacoity', 'Hit_Run', 'Illegal_Arms', 'Corruption']:</w:t>
+        <w:t xml:space="preserve">    for col in ['Total_Crimes', 'Murder', 'Rape', 'Kidnapping', 'Robbery']:</w:t>
         <w:br/>
         <w:t xml:space="preserve">        fact_2024[col] = fact_2024[col].fillna(0).astype(int)</w:t>
         <w:br/>
@@ -1882,9 +1872,9 @@
         <w:br/>
         <w:t xml:space="preserve">        # We set them to 0 (meaning 'No Data Available' for specific breakdowns, only Total Crimes is available).</w:t>
         <w:br/>
-        <w:t xml:space="preserve">        rate_cols = ['Murder', 'Rape', 'Kidnapping', 'Extortion', 'Robbery_Dacoity', 'Hit_Run', 'Illegal_Arms']</w:t>
-        <w:br/>
-        <w:t xml:space="preserve">        for col in rate_cols + ['Corruption']:</w:t>
+        <w:t xml:space="preserve">        rate_cols = ['Murder', 'Rape', 'Kidnapping', 'Robbery']</w:t>
+        <w:br/>
+        <w:t xml:space="preserve">        for col in rate_cols:</w:t>
         <w:br/>
         <w:t xml:space="preserve">            df_y[col] = 0</w:t>
         <w:br/>
@@ -1902,7 +1892,7 @@
         <w:br/>
         <w:t xml:space="preserve">    # 8. Export</w:t>
         <w:br/>
-        <w:t xml:space="preserve">    cols_to_keep = ['State_ID', 'Year', 'Total_Crimes', 'Crime_Rate', 'Literacy_Rate', 'Murder', 'Rape', 'Kidnapping', 'Extortion', 'Robbery_Dacoity', 'Hit_Run', 'Illegal_Arms', 'Corruption']</w:t>
+        <w:t xml:space="preserve">    cols_to_keep = ['State_ID', 'Year', 'Total_Crimes', 'Crime_Rate', 'Literacy_Rate', 'Murder', 'Rape', 'Kidnapping', 'Robbery']</w:t>
         <w:br/>
         <w:t xml:space="preserve">    fact_crime = fact_crime[cols_to_keep]</w:t>
         <w:br/>
@@ -1990,15 +1980,7 @@
         <w:br/>
         <w:t xml:space="preserve">    Kidnapping INTEGER,</w:t>
         <w:br/>
-        <w:t xml:space="preserve">    Extortion INTEGER,</w:t>
-        <w:br/>
-        <w:t xml:space="preserve">    Robbery_Dacoity INTEGER,</w:t>
-        <w:br/>
-        <w:t xml:space="preserve">    Hit_Run INTEGER,</w:t>
-        <w:br/>
-        <w:t xml:space="preserve">    Illegal_Arms INTEGER,</w:t>
-        <w:br/>
-        <w:t xml:space="preserve">    Corruption INTEGER,</w:t>
+        <w:t xml:space="preserve">    Robbery INTEGER,</w:t>
         <w:br/>
         <w:t xml:space="preserve">    FOREIGN KEY(State_ID) REFERENCES Dim_State(State_ID)</w:t>
         <w:br/>

</xml_diff>

<commit_message>
Enhance Phase 8 ROLAP description
</commit_message>
<xml_diff>
--- a/Final_Project_Report_Formatted.docx
+++ b/Final_Project_Report_Formatted.docx
@@ -543,12 +543,17 @@
         <w:rPr>
           <w:b/>
         </w:rPr>
-        <w:t>Phase 8: Create Data Cube</w:t>
+        <w:t>Phase 8: Create Data Cube (ROLAP Implementation)</w:t>
       </w:r>
     </w:p>
     <w:p>
       <w:r>
-        <w:t>Dimensions</w:t>
+        <w:t>For this project, we implemented a Relational OLAP (ROLAP) Data Cube. Rather than using a physical multi-dimensional server, we defined a logical cube over our Star Schema that mathematically maps our dimensions to our analytical measures.</w:t>
+      </w:r>
+    </w:p>
+    <w:p>
+      <w:r>
+        <w:t>Cube Architecture:</w:t>
       </w:r>
     </w:p>
     <w:p>
@@ -556,7 +561,7 @@
         <w:pStyle w:val="ListBullet"/>
       </w:pPr>
       <w:r>
-        <w:t>• State</w:t>
+        <w:t>• Dimensions (Axes): Location (State), Time (Year), Category (Crime Type)</w:t>
       </w:r>
     </w:p>
     <w:p>
@@ -564,63 +569,7 @@
         <w:pStyle w:val="ListBullet"/>
       </w:pPr>
       <w:r>
-        <w:t>• Year</w:t>
-      </w:r>
-    </w:p>
-    <w:p>
-      <w:pPr>
-        <w:pStyle w:val="ListBullet"/>
-      </w:pPr>
-      <w:r>
-        <w:t>• Crime Type</w:t>
-      </w:r>
-    </w:p>
-    <w:p>
-      <w:r>
-        <w:t>Measures</w:t>
-      </w:r>
-    </w:p>
-    <w:p>
-      <w:pPr>
-        <w:pStyle w:val="ListBullet"/>
-      </w:pPr>
-      <w:r>
-        <w:t>• Total Crimes</w:t>
-      </w:r>
-    </w:p>
-    <w:p>
-      <w:pPr>
-        <w:pStyle w:val="ListBullet"/>
-      </w:pPr>
-      <w:r>
-        <w:t>• Crime Rate</w:t>
-      </w:r>
-    </w:p>
-    <w:p>
-      <w:pPr>
-        <w:pStyle w:val="ListBullet"/>
-      </w:pPr>
-      <w:r>
-        <w:t>• Illiteracy Rate</w:t>
-      </w:r>
-    </w:p>
-    <w:p>
-      <w:r>
-        <w:t>Cube</w:t>
-        <w:br/>
-        <w:t xml:space="preserve">        Time</w:t>
-        <w:br/>
-        <w:t xml:space="preserve">         |</w:t>
-        <w:br/>
-        <w:t xml:space="preserve">         |</w:t>
-        <w:br/>
-        <w:t>Location ---- Crime Counts</w:t>
-        <w:br/>
-        <w:t xml:space="preserve">         |</w:t>
-        <w:br/>
-        <w:t xml:space="preserve">         |</w:t>
-        <w:br/>
-        <w:t xml:space="preserve">    Crime Type</w:t>
+        <w:t>• Calculated Measures: Total Crimes, Crime Rate per 1 Lakh, Literacy Rate</w:t>
       </w:r>
     </w:p>
     <w:p>
@@ -633,7 +582,7 @@
         </w:rPr>
         <w:t>Deliverable</w:t>
         <w:br/>
-        <w:t>Data Cube</w:t>
+        <w:t>Logical Data Cube Architecture Diagram (See Flowchart Below)</w:t>
       </w:r>
     </w:p>
     <w:p>

</xml_diff>

<commit_message>
Revert Phase 8 text to original
</commit_message>
<xml_diff>
--- a/Final_Project_Report_Formatted.docx
+++ b/Final_Project_Report_Formatted.docx
@@ -543,17 +543,12 @@
         <w:rPr>
           <w:b/>
         </w:rPr>
-        <w:t>Phase 8: Create Data Cube (ROLAP Implementation)</w:t>
+        <w:t>Phase 8: Create Data Cube</w:t>
       </w:r>
     </w:p>
     <w:p>
       <w:r>
-        <w:t>For this project, we implemented a Relational OLAP (ROLAP) Data Cube. Rather than using a physical multi-dimensional server, we defined a logical cube over our Star Schema that mathematically maps our dimensions to our analytical measures.</w:t>
-      </w:r>
-    </w:p>
-    <w:p>
-      <w:r>
-        <w:t>Cube Architecture:</w:t>
+        <w:t>Dimensions</w:t>
       </w:r>
     </w:p>
     <w:p>
@@ -561,7 +556,7 @@
         <w:pStyle w:val="ListBullet"/>
       </w:pPr>
       <w:r>
-        <w:t>• Dimensions (Axes): Location (State), Time (Year), Category (Crime Type)</w:t>
+        <w:t>• State</w:t>
       </w:r>
     </w:p>
     <w:p>
@@ -569,7 +564,63 @@
         <w:pStyle w:val="ListBullet"/>
       </w:pPr>
       <w:r>
-        <w:t>• Calculated Measures: Total Crimes, Crime Rate per 1 Lakh, Literacy Rate</w:t>
+        <w:t>• Year</w:t>
+      </w:r>
+    </w:p>
+    <w:p>
+      <w:pPr>
+        <w:pStyle w:val="ListBullet"/>
+      </w:pPr>
+      <w:r>
+        <w:t>• Crime Type</w:t>
+      </w:r>
+    </w:p>
+    <w:p>
+      <w:r>
+        <w:t>Measures</w:t>
+      </w:r>
+    </w:p>
+    <w:p>
+      <w:pPr>
+        <w:pStyle w:val="ListBullet"/>
+      </w:pPr>
+      <w:r>
+        <w:t>• Total Crimes</w:t>
+      </w:r>
+    </w:p>
+    <w:p>
+      <w:pPr>
+        <w:pStyle w:val="ListBullet"/>
+      </w:pPr>
+      <w:r>
+        <w:t>• Crime Rate</w:t>
+      </w:r>
+    </w:p>
+    <w:p>
+      <w:pPr>
+        <w:pStyle w:val="ListBullet"/>
+      </w:pPr>
+      <w:r>
+        <w:t>• Illiteracy Rate</w:t>
+      </w:r>
+    </w:p>
+    <w:p>
+      <w:r>
+        <w:t>Cube</w:t>
+        <w:br/>
+        <w:t xml:space="preserve">        Time</w:t>
+        <w:br/>
+        <w:t xml:space="preserve">         |</w:t>
+        <w:br/>
+        <w:t xml:space="preserve">         |</w:t>
+        <w:br/>
+        <w:t>Location ---- Crime Counts</w:t>
+        <w:br/>
+        <w:t xml:space="preserve">         |</w:t>
+        <w:br/>
+        <w:t xml:space="preserve">         |</w:t>
+        <w:br/>
+        <w:t xml:space="preserve">    Crime Type</w:t>
       </w:r>
     </w:p>
     <w:p>
@@ -582,7 +633,7 @@
         </w:rPr>
         <w:t>Deliverable</w:t>
         <w:br/>
-        <w:t>Logical Data Cube Architecture Diagram (See Flowchart Below)</w:t>
+        <w:t>Data Cube</w:t>
       </w:r>
     </w:p>
     <w:p>

</xml_diff>